<commit_message>
Completa serie de batería, firmware y kWp en el reporte para Deye
Co-Authored-By: Claude Sonnet 5.5 <noreply@anthropic.com>
Claude-Session: https://claude.ai/code/session_01PrsPnokVVzhQLh9aqiRZTG
</commit_message>
<xml_diff>
--- a/reportes/Caso_Casa18PR_Soporte_Deye.docx
+++ b/reportes/Caso_Casa18PR_Soporte_Deye.docx
@@ -222,7 +222,7 @@
                 <w:sz w:val="18"/>
                 <w:szCs w:val="18"/>
               </w:rPr>
-              <w:t xml:space="preserve">Alto voltaje (~310 V), litio. Modelo y número de serie: pendiente de completar</w:t>
+              <w:t xml:space="preserve">Alto voltaje (~310 V), litio. Dos unidades en la arquitectura de la plataforma: 2412240075M01 y 07301000D2110072</w:t>
             </w:r>
           </w:p>
         </w:tc>
@@ -252,7 +252,7 @@
                 <w:sz w:val="18"/>
                 <w:szCs w:val="18"/>
               </w:rPr>
-              <w:t xml:space="preserve">Firmware del inversor</w:t>
+              <w:t xml:space="preserve">Registrador de datos</w:t>
             </w:r>
           </w:p>
         </w:tc>
@@ -280,7 +280,7 @@
                 <w:sz w:val="18"/>
                 <w:szCs w:val="18"/>
               </w:rPr>
-              <w:t xml:space="preserve">Pendiente de completar</w:t>
+              <w:t xml:space="preserve">3133040960</w:t>
             </w:r>
           </w:p>
         </w:tc>
@@ -310,7 +310,7 @@
                 <w:sz w:val="18"/>
                 <w:szCs w:val="18"/>
               </w:rPr>
-              <w:t xml:space="preserve">Red</w:t>
+              <w:t xml:space="preserve">Versiones de firmware</w:t>
             </w:r>
           </w:p>
         </w:tc>
@@ -338,7 +338,7 @@
                 <w:sz w:val="18"/>
                 <w:szCs w:val="18"/>
               </w:rPr>
-              <w:t xml:space="preserve">120/208 V, operador de red EMCALI</w:t>
+              <w:t xml:space="preserve">Principal 3002-1077-1E08 · HMI 2001-C036 · Protocolo 0104 · Batería de litio 4003 (hardware 4002) · Placa de control 08 · Microcontrolador 1E · Arc Board F204</w:t>
             </w:r>
           </w:p>
         </w:tc>
@@ -368,6 +368,64 @@
                 <w:sz w:val="18"/>
                 <w:szCs w:val="18"/>
               </w:rPr>
+              <w:t xml:space="preserve">Red</w:t>
+            </w:r>
+          </w:p>
+        </w:tc>
+        <w:tc>
+          <w:tcPr>
+            <w:tcW w:type="dxa" w:w="6760"/>
+            <w:tcBorders>
+              <w:top w:val="single" w:color="BBBBBB" w:sz="4"/>
+              <w:left w:val="single" w:color="BBBBBB" w:sz="4"/>
+              <w:bottom w:val="single" w:color="BBBBBB" w:sz="4"/>
+              <w:right w:val="single" w:color="BBBBBB" w:sz="4"/>
+            </w:tcBorders>
+            <w:tcMar>
+              <w:top w:type="dxa" w:w="60"/>
+              <w:left w:type="dxa" w:w="90"/>
+              <w:bottom w:type="dxa" w:w="60"/>
+              <w:right w:type="dxa" w:w="90"/>
+            </w:tcMar>
+          </w:tcPr>
+          <w:p>
+            <w:r>
+              <w:rPr>
+                <w:b w:val="false"/>
+                <w:bCs w:val="false"/>
+                <w:sz w:val="18"/>
+                <w:szCs w:val="18"/>
+              </w:rPr>
+              <w:t xml:space="preserve">120/208 V, operador de red EMCALI</w:t>
+            </w:r>
+          </w:p>
+        </w:tc>
+      </w:tr>
+      <w:tr>
+        <w:tc>
+          <w:tcPr>
+            <w:tcW w:type="dxa" w:w="2600"/>
+            <w:tcBorders>
+              <w:top w:val="single" w:color="BBBBBB" w:sz="4"/>
+              <w:left w:val="single" w:color="BBBBBB" w:sz="4"/>
+              <w:bottom w:val="single" w:color="BBBBBB" w:sz="4"/>
+              <w:right w:val="single" w:color="BBBBBB" w:sz="4"/>
+            </w:tcBorders>
+            <w:tcMar>
+              <w:top w:type="dxa" w:w="60"/>
+              <w:left w:type="dxa" w:w="90"/>
+              <w:bottom w:type="dxa" w:w="60"/>
+              <w:right w:type="dxa" w:w="90"/>
+            </w:tcMar>
+          </w:tcPr>
+          <w:p>
+            <w:r>
+              <w:rPr>
+                <w:b w:val="false"/>
+                <w:bCs w:val="false"/>
+                <w:sz w:val="18"/>
+                <w:szCs w:val="18"/>
+              </w:rPr>
               <w:t xml:space="preserve">Paneles</w:t>
             </w:r>
           </w:p>
@@ -396,7 +454,7 @@
                 <w:sz w:val="18"/>
                 <w:szCs w:val="18"/>
               </w:rPr>
-              <w:t xml:space="preserve">4 kWp</w:t>
+              <w:t xml:space="preserve">4,16 kWp</w:t>
             </w:r>
           </w:p>
         </w:tc>
@@ -4114,7 +4172,7 @@
         <w:spacing w:after="120"/>
       </w:pPr>
       <w:r>
-        <w:t xml:space="preserve">Capturas de la plataforma de monitoreo, leídas el 02/10/2026.</w:t>
+        <w:t xml:space="preserve">Capturas de la plataforma de monitoreo, leídas el 02/10/2026. Las versiones de firmware y los números de serie de la sección inicial salen de las pantallas Información de versión y Arquitectura de la misma plataforma.</w:t>
       </w:r>
     </w:p>
     <w:tbl>

</xml_diff>

<commit_message>
Reporte Deye: comparación con Casa 2 y corrección de cortes de red
Co-Authored-By: Claude Sonnet 5.5 <noreply@anthropic.com>
Claude-Session: https://claude.ai/code/session_01PrsPnokVVzhQLh9aqiRZTG
</commit_message>
<xml_diff>
--- a/reportes/Caso_Casa18PR_Soporte_Deye.docx
+++ b/reportes/Caso_Casa18PR_Soporte_Deye.docx
@@ -675,7 +675,7 @@
         <w:spacing w:after="120"/>
       </w:pPr>
       <w:r>
-        <w:t xml:space="preserve">El medidor de red marca cuándo se va y vuelve la tensión del OR. El medidor solar, que está aguas abajo del inversor, marca cuándo la casa se queda sin energía. En la caída de la red no hubo ningún apagón: el paso al respaldo fue continuo. El apagón aparece al volver la red.</w:t>
+        <w:t xml:space="preserve">El medidor de red marca cuándo se va y vuelve la tensión de la red. El medidor solar, que está aguas abajo del inversor, marca cuándo la casa se queda sin energía. En la caída de la red no hubo ningún apagón: el paso al respaldo fue continuo. El apagón aparece al volver la red.</w:t>
       </w:r>
     </w:p>
     <w:tbl>
@@ -2076,6 +2076,14 @@
     </w:tbl>
     <w:p>
       <w:pPr>
+        <w:spacing w:after="120"/>
+      </w:pPr>
+      <w:r>
+        <w:t xml:space="preserve">Los cortes de red de la 18PR no fueron de todo el sector. Los del 01/10 a las 21:31 y 21:41 solo los vieron 2 de las 50 casas de la flota (la 18PR y la Casa 12), y la Casa 12 no se apagó. Los del 25/09 y 27/09 no los vio ninguna otra casa.</w:t>
+      </w:r>
+    </w:p>
+    <w:p>
+      <w:pPr>
         <w:spacing w:after="120" w:before="120"/>
       </w:pPr>
       <w:r>
@@ -2088,7 +2096,32 @@
         <w:spacing w:after="120" w:before="300"/>
       </w:pPr>
       <w:r>
-        <w:t xml:space="preserve">3. Corriente de salida al conectar el carro</w:t>
+        <w:t xml:space="preserve">3. Comparación con la Casa 2 (mismo inversor)</w:t>
+      </w:r>
+    </w:p>
+    <w:p>
+      <w:pPr>
+        <w:spacing w:after="120"/>
+      </w:pPr>
+      <w:r>
+        <w:t xml:space="preserve">La Casa 2 (Reservas de Pance) tiene el mismo modelo, SUN-15K-SG01HP3 HV trifásico, y no tuvo ningún apagón de ~31 s al volver la red en 4 eventos de septiembre, incluido un corte de 2 h 55 min el 29/09. En el mismo período, 8 de las 17 casas Deye con eventos tuvieron ese apagón en todos sus eventos, 2 (Casa 2 y Casa 63) en ninguno y el resto en parte. Con el mismo modelo y resultados distintos, el apagón parece depender de la instalación o de la configuración de cada casa. Pedimos a Deye comparar la configuración exportada de las dos casas.</w:t>
+      </w:r>
+    </w:p>
+    <w:p>
+      <w:pPr>
+        <w:spacing w:after="120"/>
+      </w:pPr>
+      <w:r>
+        <w:t xml:space="preserve">Un análisis complementario, que no hemos verificado, reporta además: salida del inversor apagándose y encendiéndose cada ~40 s durante cortes largos (50 ciclos en 33 min el 16/08), tensión de red de 95 V el 16/08 con el inversor en fault, y estado fault del 19 al 26/09. Pedimos el historial de alarmas de esas fechas.</w:t>
+      </w:r>
+    </w:p>
+    <w:p>
+      <w:pPr>
+        <w:pStyle w:val="Heading1"/>
+        <w:spacing w:after="120" w:before="300"/>
+      </w:pPr>
+      <w:r>
+        <w:t xml:space="preserve">4. Corriente de salida al conectar el carro</w:t>
       </w:r>
     </w:p>
     <w:p>
@@ -4139,7 +4172,7 @@
         <w:spacing w:after="120" w:before="300"/>
       </w:pPr>
       <w:r>
-        <w:t xml:space="preserve">4. Evento del 18/09</w:t>
+        <w:t xml:space="preserve">5. Evento del 18/09</w:t>
       </w:r>
     </w:p>
     <w:p>
@@ -4164,7 +4197,7 @@
         <w:spacing w:after="120" w:before="300"/>
       </w:pPr>
       <w:r>
-        <w:t xml:space="preserve">5. Configuración actual del inversor</w:t>
+        <w:t xml:space="preserve">6. Configuración actual del inversor</w:t>
       </w:r>
     </w:p>
     <w:p>
@@ -4793,7 +4826,7 @@
         <w:spacing w:after="120" w:before="300"/>
       </w:pPr>
       <w:r>
-        <w:t xml:space="preserve">6. Carga de día frente a carga de noche</w:t>
+        <w:t xml:space="preserve">7. Carga de día frente a carga de noche</w:t>
       </w:r>
     </w:p>
     <w:tbl>
@@ -5353,7 +5386,7 @@
         <w:spacing w:after="120" w:before="300"/>
       </w:pPr>
       <w:r>
-        <w:t xml:space="preserve">7. Preguntas para Deye</w:t>
+        <w:t xml:space="preserve">8. Preguntas para Deye</w:t>
       </w:r>
     </w:p>
     <w:p>
@@ -5397,7 +5430,7 @@
         <w:spacing w:after="80"/>
       </w:pPr>
       <w:r>
-        <w:t xml:space="preserve">¿Es normal que la casa quede sin energía unos 31 a 32 s cuando vuelve la red? ¿Qué parámetros lo controlan (Backup Delay, Reconnection Time, rampas de reconexión)? ¿Existe una versión de firmware que lo corrija?</w:t>
+        <w:t xml:space="preserve">¿Es normal que la casa quede sin energía unos 31 a 32 s cuando vuelve la red? La Casa 2, con el mismo inversor, no lo presenta. ¿Pueden comparar las configuraciones exportadas de las dos casas? ¿Qué parámetros lo controlan (Backup Delay, Reconnection Time, rampas de reconexión)? ¿Existe una versión de firmware que lo corrija?</w:t>
       </w:r>
     </w:p>
     <w:p>
@@ -5410,7 +5443,7 @@
         <w:spacing w:after="80"/>
       </w:pPr>
       <w:r>
-        <w:t xml:space="preserve">¿Qué protección actuó el 18/09 a las 19:22 y por qué el inversor quedó 7,7 días sin leer la red?</w:t>
+        <w:t xml:space="preserve">¿Qué significan los estados fault del 16/08 y del 19 al 26/09, y el ciclado de la salida cada ~40 s durante cortes largos? ¿Qué protección actuó el 18/09 a las 19:22 y por qué el inversor quedó 7,7 días sin leer la red?</w:t>
       </w:r>
     </w:p>
     <w:p>
@@ -5445,7 +5478,7 @@
         <w:spacing w:after="120" w:before="300"/>
       </w:pPr>
       <w:r>
-        <w:t xml:space="preserve">8. Limitaciones de los datos</w:t>
+        <w:t xml:space="preserve">9. Limitaciones de los datos</w:t>
       </w:r>
     </w:p>
     <w:p>
@@ -5484,7 +5517,7 @@
         <w:spacing w:after="60"/>
       </w:pPr>
       <w:r>
-        <w:t xml:space="preserve">Que las cargas de ~7 a 8,7 kW sean un carro eléctrico lo inferimos por la magnitud y la duración; falta confirmarlo con el cliente.</w:t>
+        <w:t xml:space="preserve">Los datos del 14/07 al 31/08 y el ciclado de ~40 s provienen de un análisis de terceros que no hemos verificado.</w:t>
       </w:r>
     </w:p>
     <w:p>
@@ -5497,6 +5530,19 @@
         <w:spacing w:after="60"/>
       </w:pPr>
       <w:r>
+        <w:t xml:space="preserve">Que las cargas de ~7 a 8,7 kW sean un carro eléctrico lo inferimos por la magnitud y la duración; falta confirmarlo con el cliente.</w:t>
+      </w:r>
+    </w:p>
+    <w:p>
+      <w:pPr>
+        <w:pStyle w:val="ListParagraph"/>
+        <w:numPr>
+          <w:ilvl w:val="0"/>
+          <w:numId w:val="3"/>
+        </w:numPr>
+        <w:spacing w:after="60"/>
+      </w:pPr>
+      <w:r>
         <w:t xml:space="preserve">Los límites por fase del manual SUN-5/25K-SG01HP3-EU-AM2 corresponden a la versión europea; el equipo instalado trabaja a 120/208 V.</w:t>
       </w:r>
     </w:p>
@@ -5506,7 +5552,7 @@
         <w:spacing w:after="120" w:before="300"/>
       </w:pPr>
       <w:r>
-        <w:t xml:space="preserve">9. Pruebas propuestas en sitio</w:t>
+        <w:t xml:space="preserve">10. Pruebas propuestas en sitio</w:t>
       </w:r>
     </w:p>
     <w:p>

</xml_diff>

<commit_message>
Reporte Deye: inversor apagado por el equipo tras el 18/09, sin hallazgos en la visita
Co-Authored-By: Claude Sonnet 5.5 <noreply@anthropic.com>
Claude-Session: https://claude.ai/code/session_01PrsPnokVVzhQLh9aqiRZTG
</commit_message>
<xml_diff>
--- a/reportes/Caso_Casa18PR_Soporte_Deye.docx
+++ b/reportes/Caso_Casa18PR_Soporte_Deye.docx
@@ -647,10 +647,10 @@
           <w:b/>
           <w:bCs/>
         </w:rPr>
-        <w:t xml:space="preserve">Evento del 18/09 sin explicación. </w:t>
+        <w:t xml:space="preserve">Evento del 18/09 sin causa identificada. </w:t>
       </w:r>
       <w:r>
-        <w:t xml:space="preserve">La casa quedó sin energía con la red presente y el inversor leyó 0 V de red durante 7,7 días.</w:t>
+        <w:t xml:space="preserve">La casa quedó sin energía con la red presente. El inversor se dejó apagado hasta el 26/09 mientras se identificaba la falla y la visita al sitio no encontró ningún hallazgo técnico.</w:t>
       </w:r>
     </w:p>
     <w:p>
@@ -2112,7 +2112,7 @@
         <w:spacing w:after="120"/>
       </w:pPr>
       <w:r>
-        <w:t xml:space="preserve">Un análisis complementario, que no hemos verificado, reporta además: salida del inversor apagándose y encendiéndose cada ~40 s durante cortes largos (50 ciclos en 33 min el 16/08), tensión de red de 95 V el 16/08 con el inversor en fault, y estado fault del 19 al 26/09. Pedimos el historial de alarmas de esas fechas.</w:t>
+        <w:t xml:space="preserve">Un análisis complementario, que no hemos verificado, reporta además: salida del inversor apagándose y encendiéndose cada ~40 s durante cortes largos (50 ciclos en 33 min el 16/08), y tensión de red de 95 V el 16/08 con el inversor en fault. Pedimos el historial de alarmas de esas fechas. El estado fault que ese análisis ve del 19 al 26/09 coincide con el apagado del inversor por el equipo.</w:t>
       </w:r>
     </w:p>
     <w:p>
@@ -4188,7 +4188,7 @@
         <w:spacing w:after="120"/>
       </w:pPr>
       <w:r>
-        <w:t xml:space="preserve">Desde las 20:00 de ese día el inversor leyó 0 V en la red hasta el 26/09 a las 13:15 (7,7 días). En ese lapso registró carga de 0 W, generación solar máxima de 43 W y tensión de salida inestable (0 a 153 V). El 26/09 los medidores marcan eventos a las 12:19 y 13:30, que sugieren una visita al sitio. No sabemos qué protección actuó ni qué se hizo en la visita.</w:t>
+        <w:t xml:space="preserve">Desde ese momento el equipo de operación dejó el inversor apagado mientras se identificaba la falla. Por eso los datos muestran 0 V de red en el inversor, carga de 0 W y generación máxima de 43 W hasta el 26/09 a las 13:15 (7,7 días). En la visita al sitio del 26/09 no se encontró ningún hallazgo técnico de falla. No sabemos qué protección actuó; el registro de alarmas del inversor es la evidencia que falta.</w:t>
       </w:r>
     </w:p>
     <w:p>
@@ -5443,7 +5443,7 @@
         <w:spacing w:after="80"/>
       </w:pPr>
       <w:r>
-        <w:t xml:space="preserve">¿Qué significan los estados fault del 16/08 y del 19 al 26/09, y el ciclado de la salida cada ~40 s durante cortes largos? ¿Qué protección actuó el 18/09 a las 19:22 y por qué el inversor quedó 7,7 días sin leer la red?</w:t>
+        <w:t xml:space="preserve">¿Qué significan el fault del 16/08 y el ciclado de la salida cada ~40 s durante cortes largos? ¿Qué protección actuó el 18/09 a las 19:22? El inversor se dejó apagado hasta el 26/09 y la visita no encontró ninguna falla técnica.</w:t>
       </w:r>
     </w:p>
     <w:p>

</xml_diff>